<commit_message>
Correct 5 Sept threat wording per Allan: 'barilin kita' (shoot), add epithets + firearm
Allan's same-day correction: the threat was to SHOOT ('barilin kita'),
not punch; adds 'manloloko, magnanakaw' epithets (resolving the garbled
'Man lolo ko' fragment), Allan's knowledge that Ace keeps and shows off
a firearm, and a request that authorities verify Ace's firearm license.
Elevates the charge framing to Grave Threats with a firearm + Grave Oral
Defamation. Counsel flags record the correction trail and require the
witnesses to be asked cold what they heard before signing.

Co-Authored-By: Claude Fable 5 <noreply@anthropic.com>
Claude-Session: https://claude.ai/code/session_01UpQ6SZaDgERSUKhzTqk5Nt
</commit_message>
<xml_diff>
--- a/case_work/Paracale-001/BLOTTER_SUPPLEMENTAL_AFFIDAVIT_ALLAN_2026-09-05.docx
+++ b/case_work/Paracale-001/BLOTTER_SUPPLEMENTAL_AFFIDAVIT_ALLAN_2026-09-05.docx
@@ -281,15 +281,15 @@
           <w:sz w:val="24"/>
           <w:szCs w:val="24"/>
         </w:rPr>
-        <w:t xml:space="preserve">“Umalis ka dito at susuntukin kita! Putang ina mo, hayop ka! Alis kayo dito!”</w:t>
-      </w:r>
-      <w:r>
-        <w:rPr>
-          <w:rFonts w:ascii="Times New Roman" w:cs="Times New Roman" w:eastAsia="Times New Roman" w:hAnsi="Times New Roman"/>
-          <w:sz w:val="24"/>
-          <w:szCs w:val="24"/>
-        </w:rPr>
-        <w:t xml:space="preserve"> (in English: “Leave this place or I will punch you! You son of a whore, you animal! All of you, get out of here!”).</w:t>
+        <w:t xml:space="preserve">“Umalis ka dito at barilin kita! Putang ina mo, hayop ka! Manloloko, magnanakaw! Alis kayo dito!”</w:t>
+      </w:r>
+      <w:r>
+        <w:rPr>
+          <w:rFonts w:ascii="Times New Roman" w:cs="Times New Roman" w:eastAsia="Times New Roman" w:hAnsi="Times New Roman"/>
+          <w:sz w:val="24"/>
+          <w:szCs w:val="24"/>
+        </w:rPr>
+        <w:t xml:space="preserve"> (in English: “Leave this place or I will shoot you! You son of a whore, you animal! Swindler, thief! All of you, get out of here!”).</w:t>
       </w:r>
     </w:p>
     <w:p>
@@ -367,7 +367,25 @@
           <w:sz w:val="24"/>
           <w:szCs w:val="24"/>
         </w:rPr>
-        <w:t xml:space="preserve">7.  I was stunned and genuinely feared for my life, because my brother </w:t>
+        <w:t xml:space="preserve">7.  I was stunned, intimidated, and genuinely feared for my life. </w:t>
+      </w:r>
+      <w:r>
+        <w:rPr>
+          <w:rFonts w:ascii="Times New Roman" w:cs="Times New Roman" w:eastAsia="Times New Roman" w:hAnsi="Times New Roman"/>
+          <w:b/>
+          <w:bCs/>
+          <w:sz w:val="24"/>
+          <w:szCs w:val="24"/>
+        </w:rPr>
+        <w:t xml:space="preserve">I personally know that Respondent keeps a firearm and has openly shown off shooting it</w:t>
+      </w:r>
+      <w:r>
+        <w:rPr>
+          <w:rFonts w:ascii="Times New Roman" w:cs="Times New Roman" w:eastAsia="Times New Roman" w:hAnsi="Times New Roman"/>
+          <w:sz w:val="24"/>
+          <w:szCs w:val="24"/>
+        </w:rPr>
+        <w:t xml:space="preserve">, so his threat to shoot me was real to me. Moreover, my brother </w:t>
       </w:r>
       <w:r>
         <w:rPr>
@@ -448,17 +466,17 @@
           <w:sz w:val="24"/>
           <w:szCs w:val="24"/>
         </w:rPr>
-        <w:t xml:space="preserve">10.  The foregoing acts of Respondent — publicly threatening to punch and strike me, and cursing and defaming me in front of my professional guests — constitute, among others, </w:t>
-      </w:r>
-      <w:r>
-        <w:rPr>
-          <w:rFonts w:ascii="Times New Roman" w:cs="Times New Roman" w:eastAsia="Times New Roman" w:hAnsi="Times New Roman"/>
-          <w:b/>
-          <w:bCs/>
-          <w:sz w:val="24"/>
-          <w:szCs w:val="24"/>
-        </w:rPr>
-        <w:t xml:space="preserve">Grave Threats (Article 282, Revised Penal Code) or, in the alternative, Other Light Threats (Article 285), Grave Oral Defamation (Article 358), and/or Unjust Vexation (Article 287)</w:t>
+        <w:t xml:space="preserve">10.  The foregoing acts of Respondent — publicly threatening to shoot me and to strike me, and cursing me and publicly branding me a swindler and a thief in front of my professional guests — constitute, among others, </w:t>
+      </w:r>
+      <w:r>
+        <w:rPr>
+          <w:rFonts w:ascii="Times New Roman" w:cs="Times New Roman" w:eastAsia="Times New Roman" w:hAnsi="Times New Roman"/>
+          <w:b/>
+          <w:bCs/>
+          <w:sz w:val="24"/>
+          <w:szCs w:val="24"/>
+        </w:rPr>
+        <w:t xml:space="preserve">Grave Threats (Article 282, Revised Penal Code) — the threat being to commit a crime against my person with a firearm — and Grave Oral Defamation (Article 358) for the public imputation of crimes, and/or Unjust Vexation (Article 287)</w:t>
       </w:r>
       <w:r>
         <w:rPr>
@@ -481,7 +499,40 @@
           <w:sz w:val="24"/>
           <w:szCs w:val="24"/>
         </w:rPr>
-        <w:t xml:space="preserve">11.  I am executing this Supplemental Affidavit to attest to the truth of the foregoing based on my personal knowledge, to have this incident entered in the blotter and added to the record of my pending complaint, and to request that it be considered in the investigation and in the filing of the appropriate criminal charges against Respondent Ace Vicente Inocalla III.</w:t>
+        <w:t xml:space="preserve">11.  In view of Respondent’s threat to shoot me and my knowledge that he keeps and shows off a firearm, I likewise respectfully request that the authorities </w:t>
+      </w:r>
+      <w:r>
+        <w:rPr>
+          <w:rFonts w:ascii="Times New Roman" w:cs="Times New Roman" w:eastAsia="Times New Roman" w:hAnsi="Times New Roman"/>
+          <w:b/>
+          <w:bCs/>
+          <w:sz w:val="24"/>
+          <w:szCs w:val="24"/>
+        </w:rPr>
+        <w:t xml:space="preserve">verify whether Respondent lawfully possesses any firearm</w:t>
+      </w:r>
+      <w:r>
+        <w:rPr>
+          <w:rFonts w:ascii="Times New Roman" w:cs="Times New Roman" w:eastAsia="Times New Roman" w:hAnsi="Times New Roman"/>
+          <w:sz w:val="24"/>
+          <w:szCs w:val="24"/>
+        </w:rPr>
+        <w:t xml:space="preserve"> and take the appropriate action.</w:t>
+      </w:r>
+    </w:p>
+    <w:p>
+      <w:pPr>
+        <w:spacing w:after="200" w:line="360"/>
+        <w:ind w:firstLine="720"/>
+        <w:jc w:val="both"/>
+      </w:pPr>
+      <w:r>
+        <w:rPr>
+          <w:rFonts w:ascii="Times New Roman" w:cs="Times New Roman" w:eastAsia="Times New Roman" w:hAnsi="Times New Roman"/>
+          <w:sz w:val="24"/>
+          <w:szCs w:val="24"/>
+        </w:rPr>
+        <w:t xml:space="preserve">12.  I am executing this Supplemental Affidavit to attest to the truth of the foregoing based on my personal knowledge, to have this incident entered in the blotter and added to the record of my pending complaint, and to request that it be considered in the investigation and in the filing of the appropriate criminal charges against Respondent Ace Vicente Inocalla III.</w:t>
       </w:r>
     </w:p>
     <w:p>

</xml_diff>

<commit_message>
Add firearm photo evidence as Annexes K-M to the 5 Sept supplemental affidavit
Three photographs preserved in evidence/ace_firearms/: rifle photo (K),
shotgun + holstered pistol photo (L), and a TikTok post by account
"@Tata Ace" dated on/about 4 Sept 2026 - the day before the shooting
threat - showing range fire with multiple firearms (M). New affidavit
para 8 identifies the annexes; paras renumbered; counsel flags added
requiring positive identification of the man in each photo, provenance
of K/L, and immediate preservation of the TikTok original (URL, screen
recording, profile) before deletion.

Co-Authored-By: Claude Fable 5 <noreply@anthropic.com>
Claude-Session: https://claude.ai/code/session_01UpQ6SZaDgERSUKhzTqk5Nt
</commit_message>
<xml_diff>
--- a/case_work/Paracale-001/BLOTTER_SUPPLEMENTAL_AFFIDAVIT_ALLAN_2026-09-05.docx
+++ b/case_work/Paracale-001/BLOTTER_SUPPLEMENTAL_AFFIDAVIT_ALLAN_2026-09-05.docx
@@ -436,37 +436,106 @@
           <w:sz w:val="24"/>
           <w:szCs w:val="24"/>
         </w:rPr>
-        <w:t xml:space="preserve">8.  My companion Mr. Mario Bangasan, worried for my safety, pulled me away, and we left as Respondent grew visibly more aggressive. As we walked away, he kept on yelling threats and curses at me and my guests, still holding his phone.</w:t>
-      </w:r>
-    </w:p>
-    <w:p>
-      <w:pPr>
-        <w:spacing w:after="200" w:line="360"/>
-        <w:ind w:firstLine="720"/>
-        <w:jc w:val="both"/>
-      </w:pPr>
-      <w:r>
-        <w:rPr>
-          <w:rFonts w:ascii="Times New Roman" w:cs="Times New Roman" w:eastAsia="Times New Roman" w:hAnsi="Times New Roman"/>
-          <w:sz w:val="24"/>
-          <w:szCs w:val="24"/>
-        </w:rPr>
-        <w:t xml:space="preserve">9.  Both Mr. Mario Bangasan and Architect Mike Guevara personally witnessed the entire incident and can attest to the foregoing.</w:t>
-      </w:r>
-    </w:p>
-    <w:p>
-      <w:pPr>
-        <w:spacing w:after="200" w:line="360"/>
-        <w:ind w:firstLine="720"/>
-        <w:jc w:val="both"/>
-      </w:pPr>
-      <w:r>
-        <w:rPr>
-          <w:rFonts w:ascii="Times New Roman" w:cs="Times New Roman" w:eastAsia="Times New Roman" w:hAnsi="Times New Roman"/>
-          <w:sz w:val="24"/>
-          <w:szCs w:val="24"/>
-        </w:rPr>
-        <w:t xml:space="preserve">10.  The foregoing acts of Respondent — publicly threatening to shoot me and to strike me, and cursing me and publicly branding me a swindler and a thief in front of my professional guests — constitute, among others, </w:t>
+        <w:t xml:space="preserve">8.  In support of the foregoing, attached hereto are photographs which I personally identify as depicting Respondent, marked as follows (continuing the annex series of my Affidavit-Complaint of 2 September 2026): </w:t>
+      </w:r>
+      <w:r>
+        <w:rPr>
+          <w:rFonts w:ascii="Times New Roman" w:cs="Times New Roman" w:eastAsia="Times New Roman" w:hAnsi="Times New Roman"/>
+          <w:b/>
+          <w:bCs/>
+          <w:sz w:val="24"/>
+          <w:szCs w:val="24"/>
+        </w:rPr>
+        <w:t xml:space="preserve">Annex “K”</w:t>
+      </w:r>
+      <w:r>
+        <w:rPr>
+          <w:rFonts w:ascii="Times New Roman" w:cs="Times New Roman" w:eastAsia="Times New Roman" w:hAnsi="Times New Roman"/>
+          <w:sz w:val="24"/>
+          <w:szCs w:val="24"/>
+        </w:rPr>
+        <w:t xml:space="preserve"> — a photograph of Respondent aiming a rifle; </w:t>
+      </w:r>
+      <w:r>
+        <w:rPr>
+          <w:rFonts w:ascii="Times New Roman" w:cs="Times New Roman" w:eastAsia="Times New Roman" w:hAnsi="Times New Roman"/>
+          <w:b/>
+          <w:bCs/>
+          <w:sz w:val="24"/>
+          <w:szCs w:val="24"/>
+        </w:rPr>
+        <w:t xml:space="preserve">Annex “L”</w:t>
+      </w:r>
+      <w:r>
+        <w:rPr>
+          <w:rFonts w:ascii="Times New Roman" w:cs="Times New Roman" w:eastAsia="Times New Roman" w:hAnsi="Times New Roman"/>
+          <w:sz w:val="24"/>
+          <w:szCs w:val="24"/>
+        </w:rPr>
+        <w:t xml:space="preserve"> — a photograph of Respondent holding a shotgun, with a holstered handgun at his waist; and </w:t>
+      </w:r>
+      <w:r>
+        <w:rPr>
+          <w:rFonts w:ascii="Times New Roman" w:cs="Times New Roman" w:eastAsia="Times New Roman" w:hAnsi="Times New Roman"/>
+          <w:b/>
+          <w:bCs/>
+          <w:sz w:val="24"/>
+          <w:szCs w:val="24"/>
+        </w:rPr>
+        <w:t xml:space="preserve">Annex “M”</w:t>
+      </w:r>
+      <w:r>
+        <w:rPr>
+          <w:rFonts w:ascii="Times New Roman" w:cs="Times New Roman" w:eastAsia="Times New Roman" w:hAnsi="Times New Roman"/>
+          <w:sz w:val="24"/>
+          <w:szCs w:val="24"/>
+        </w:rPr>
+        <w:t xml:space="preserve"> — a screenshot of a post on Respondent’s own TikTok account “@Tata Ace,” posted on or about 4 September 2026 — the day before he threatened to shoot me — captioned “with my kumpare roy M.,” showing Respondent firing a pistol at a shooting range, with another pistol, ammunition, and magazines on the table before him.</w:t>
+      </w:r>
+    </w:p>
+    <w:p>
+      <w:pPr>
+        <w:spacing w:after="200" w:line="360"/>
+        <w:ind w:firstLine="720"/>
+        <w:jc w:val="both"/>
+      </w:pPr>
+      <w:r>
+        <w:rPr>
+          <w:rFonts w:ascii="Times New Roman" w:cs="Times New Roman" w:eastAsia="Times New Roman" w:hAnsi="Times New Roman"/>
+          <w:sz w:val="24"/>
+          <w:szCs w:val="24"/>
+        </w:rPr>
+        <w:t xml:space="preserve">9.  My companion Mr. Mario Bangasan, worried for my safety, pulled me away, and we left as Respondent grew visibly more aggressive. As we walked away, he kept on yelling threats and curses at me and my guests, still holding his phone.</w:t>
+      </w:r>
+    </w:p>
+    <w:p>
+      <w:pPr>
+        <w:spacing w:after="200" w:line="360"/>
+        <w:ind w:firstLine="720"/>
+        <w:jc w:val="both"/>
+      </w:pPr>
+      <w:r>
+        <w:rPr>
+          <w:rFonts w:ascii="Times New Roman" w:cs="Times New Roman" w:eastAsia="Times New Roman" w:hAnsi="Times New Roman"/>
+          <w:sz w:val="24"/>
+          <w:szCs w:val="24"/>
+        </w:rPr>
+        <w:t xml:space="preserve">10.  Both Mr. Mario Bangasan and Architect Mike Guevara personally witnessed the entire incident and can attest to the foregoing.</w:t>
+      </w:r>
+    </w:p>
+    <w:p>
+      <w:pPr>
+        <w:spacing w:after="200" w:line="360"/>
+        <w:ind w:firstLine="720"/>
+        <w:jc w:val="both"/>
+      </w:pPr>
+      <w:r>
+        <w:rPr>
+          <w:rFonts w:ascii="Times New Roman" w:cs="Times New Roman" w:eastAsia="Times New Roman" w:hAnsi="Times New Roman"/>
+          <w:sz w:val="24"/>
+          <w:szCs w:val="24"/>
+        </w:rPr>
+        <w:t xml:space="preserve">11.  The foregoing acts of Respondent — publicly threatening to shoot me and to strike me, and cursing me and publicly branding me a swindler and a thief in front of my professional guests — constitute, among others, </w:t>
       </w:r>
       <w:r>
         <w:rPr>
@@ -499,7 +568,7 @@
           <w:sz w:val="24"/>
           <w:szCs w:val="24"/>
         </w:rPr>
-        <w:t xml:space="preserve">11.  In view of Respondent’s threat to shoot me and my knowledge that he keeps and shows off a firearm, I likewise respectfully request that the authorities </w:t>
+        <w:t xml:space="preserve">12.  In view of Respondent’s threat to shoot me, my knowledge that he keeps and shows off firearms, and the photographs attached as Annexes “K” to “M,” I likewise respectfully request that the authorities </w:t>
       </w:r>
       <w:r>
         <w:rPr>
@@ -532,7 +601,7 @@
           <w:sz w:val="24"/>
           <w:szCs w:val="24"/>
         </w:rPr>
-        <w:t xml:space="preserve">12.  I am executing this Supplemental Affidavit to attest to the truth of the foregoing based on my personal knowledge, to have this incident entered in the blotter and added to the record of my pending complaint, and to request that it be considered in the investigation and in the filing of the appropriate criminal charges against Respondent Ace Vicente Inocalla III.</w:t>
+        <w:t xml:space="preserve">13.  I am executing this Supplemental Affidavit to attest to the truth of the foregoing based on my personal knowledge, to have this incident entered in the blotter and added to the record of my pending complaint, and to request that it be considered in the investigation and in the filing of the appropriate criminal charges against Respondent Ace Vicente Inocalla III.</w:t>
       </w:r>
     </w:p>
     <w:p>

</xml_diff>

<commit_message>
Correct Annex M dating: TikTok screenshot is from an OLD post, not 4 Sept 2026
Operator correction: the "@Tata Ace" range-shooting screenshot was
captured earlier for another evidence packet; the on-screen "1d ago" is
relative to the original capture, not this week. Removed the false
"posted on or about 4 September 2026 / day before the threat" claim
from the supplemental affidavit para 8, the annex M caption, and the
blotter narrative; para 8 now presents Annexes K-M as previously
obtained images showing respondent's history with firearms. Counsel
flag 1b rewritten with the correction record and authentication to-dos
(source packet, capturer, actual post date if still live). Rebuilt
docx and the 19-page PDF packet.

Co-Authored-By: Claude Fable 5 <noreply@anthropic.com>
Claude-Session: https://claude.ai/code/session_01UpQ6SZaDgERSUKhzTqk5Nt
</commit_message>
<xml_diff>
--- a/case_work/Paracale-001/BLOTTER_SUPPLEMENTAL_AFFIDAVIT_ALLAN_2026-09-05.docx
+++ b/case_work/Paracale-001/BLOTTER_SUPPLEMENTAL_AFFIDAVIT_ALLAN_2026-09-05.docx
@@ -436,7 +436,25 @@
           <w:sz w:val="24"/>
           <w:szCs w:val="24"/>
         </w:rPr>
-        <w:t xml:space="preserve">8.  In support of the foregoing, attached hereto are photographs which I personally identify as depicting Respondent, marked as follows (continuing the annex series of my Affidavit-Complaint of 2 September 2026): </w:t>
+        <w:t xml:space="preserve">8.  In support of the foregoing, attached hereto are photographs </w:t>
+      </w:r>
+      <w:r>
+        <w:rPr>
+          <w:rFonts w:ascii="Times New Roman" w:cs="Times New Roman" w:eastAsia="Times New Roman" w:hAnsi="Times New Roman"/>
+          <w:b/>
+          <w:bCs/>
+          <w:sz w:val="24"/>
+          <w:szCs w:val="24"/>
+        </w:rPr>
+        <w:t xml:space="preserve">obtained prior to the incidents complained of and kept in our family’s evidence records</w:t>
+      </w:r>
+      <w:r>
+        <w:rPr>
+          <w:rFonts w:ascii="Times New Roman" w:cs="Times New Roman" w:eastAsia="Times New Roman" w:hAnsi="Times New Roman"/>
+          <w:sz w:val="24"/>
+          <w:szCs w:val="24"/>
+        </w:rPr>
+        <w:t xml:space="preserve">, which I personally identify as depicting Respondent, marked as follows (continuing the annex series of my Affidavit-Complaint of 2 September 2026): </w:t>
       </w:r>
       <w:r>
         <w:rPr>
@@ -490,7 +508,7 @@
           <w:sz w:val="24"/>
           <w:szCs w:val="24"/>
         </w:rPr>
-        <w:t xml:space="preserve"> — a screenshot of a post on Respondent’s own TikTok account “@Tata Ace,” posted on or about 4 September 2026 — the day before he threatened to shoot me — captioned “with my kumpare roy M.,” showing Respondent firing a pistol at a shooting range, with another pistol, ammunition, and magazines on the table before him.</w:t>
+        <w:t xml:space="preserve"> — a screenshot, captured previously, of a post on Respondent’s own TikTok account “@Tata Ace,” captioned “with my kumpare roy M.,” showing Respondent firing a pistol at a shooting range, with another pistol, ammunition, and magazines on the table before him. These earlier images show that Respondent has long kept, displayed, and fired guns, which is why his threat to shoot me was real to me.</w:t>
       </w:r>
     </w:p>
     <w:p>

</xml_diff>